<commit_message>
user story and save load functionality
</commit_message>
<xml_diff>
--- a/User Stories.docx
+++ b/User Stories.docx
@@ -1,6 +1,6 @@
 
 <file path=word/document.xml><?xml version="1.0" encoding="utf-8"?>
-<w:document xmlns:wpc="http://schemas.microsoft.com/office/word/2010/wordprocessingCanvas" xmlns:cx="http://schemas.microsoft.com/office/drawing/2014/chartex" xmlns:cx1="http://schemas.microsoft.com/office/drawing/2015/9/8/chartex" xmlns:cx2="http://schemas.microsoft.com/office/drawing/2015/10/21/chartex" xmlns:cx3="http://schemas.microsoft.com/office/drawing/2016/5/9/chartex" xmlns:cx4="http://schemas.microsoft.com/office/drawing/2016/5/10/chartex" xmlns:cx5="http://schemas.microsoft.com/office/drawing/2016/5/11/chartex" xmlns:cx6="http://schemas.microsoft.com/office/drawing/2016/5/12/chartex" xmlns:cx7="http://schemas.microsoft.com/office/drawing/2016/5/13/chartex" xmlns:cx8="http://schemas.microsoft.com/office/drawing/2016/5/14/chartex" xmlns:mc="http://schemas.openxmlformats.org/markup-compatibility/2006" xmlns:aink="http://schemas.microsoft.com/office/drawing/2016/ink" xmlns:am3d="http://schemas.microsoft.com/office/drawing/2017/model3d" xmlns:o="urn:schemas-microsoft-com:office:office" xmlns:oel="http://schemas.microsoft.com/office/2019/extlst" xmlns:r="http://schemas.openxmlformats.org/officeDocument/2006/relationships" xmlns:m="http://schemas.openxmlformats.org/officeDocument/2006/math" xmlns:v="urn:schemas-microsoft-com:vml" xmlns:wp14="http://schemas.microsoft.com/office/word/2010/wordprocessingDrawing" xmlns:wp="http://schemas.openxmlformats.org/drawingml/2006/wordprocessingDrawing" xmlns:w10="urn:schemas-microsoft-com:office:word" xmlns:w="http://schemas.openxmlformats.org/wordprocessingml/2006/main" xmlns:w14="http://schemas.microsoft.com/office/word/2010/wordml" xmlns:w15="http://schemas.microsoft.com/office/word/2012/wordml" xmlns:w16cex="http://schemas.microsoft.com/office/word/2018/wordml/cex" xmlns:w16cid="http://schemas.microsoft.com/office/word/2016/wordml/cid" xmlns:w16="http://schemas.microsoft.com/office/word/2018/wordml" xmlns:w16du="http://schemas.microsoft.com/office/word/2023/wordml/word16du" xmlns:w16sdtdh="http://schemas.microsoft.com/office/word/2020/wordml/sdtdatahash" xmlns:w16sdtfl="http://schemas.microsoft.com/office/word/2024/wordml/sdtformatlock" xmlns:w16se="http://schemas.microsoft.com/office/word/2015/wordml/symex" xmlns:wpg="http://schemas.microsoft.com/office/word/2010/wordprocessingGroup" xmlns:wpi="http://schemas.microsoft.com/office/word/2010/wordprocessingInk" xmlns:wne="http://schemas.microsoft.com/office/word/2006/wordml" xmlns:wps="http://schemas.microsoft.com/office/word/2010/wordprocessingShape" mc:Ignorable="w14 w15 w16se w16cid w16 w16cex w16sdtdh w16sdtfl w16du wp14">
+<w:document xmlns:wpc="http://schemas.microsoft.com/office/word/2010/wordprocessingCanvas" xmlns:cx="http://schemas.microsoft.com/office/drawing/2014/chartex" xmlns:cx1="http://schemas.microsoft.com/office/drawing/2015/9/8/chartex" xmlns:cx2="http://schemas.microsoft.com/office/drawing/2015/10/21/chartex" xmlns:cx3="http://schemas.microsoft.com/office/drawing/2016/5/9/chartex" xmlns:cx4="http://schemas.microsoft.com/office/drawing/2016/5/10/chartex" xmlns:cx5="http://schemas.microsoft.com/office/drawing/2016/5/11/chartex" xmlns:cx6="http://schemas.microsoft.com/office/drawing/2016/5/12/chartex" xmlns:cx7="http://schemas.microsoft.com/office/drawing/2016/5/13/chartex" xmlns:cx8="http://schemas.microsoft.com/office/drawing/2016/5/14/chartex" xmlns:mc="http://schemas.openxmlformats.org/markup-compatibility/2006" xmlns:aink="http://schemas.microsoft.com/office/drawing/2016/ink" xmlns:am3d="http://schemas.microsoft.com/office/drawing/2017/model3d" xmlns:o="urn:schemas-microsoft-com:office:office" xmlns:oel="http://schemas.microsoft.com/office/2019/extlst" xmlns:r="http://schemas.openxmlformats.org/officeDocument/2006/relationships" xmlns:m="http://schemas.openxmlformats.org/officeDocument/2006/math" xmlns:v="urn:schemas-microsoft-com:vml" xmlns:wp14="http://schemas.microsoft.com/office/word/2010/wordprocessingDrawing" xmlns:wp="http://schemas.openxmlformats.org/drawingml/2006/wordprocessingDrawing" xmlns:w10="urn:schemas-microsoft-com:office:word" xmlns:w="http://schemas.openxmlformats.org/wordprocessingml/2006/main" xmlns:w14="http://schemas.microsoft.com/office/word/2010/wordml" xmlns:w15="http://schemas.microsoft.com/office/word/2012/wordml" xmlns:w16cex="http://schemas.microsoft.com/office/word/2018/wordml/cex" xmlns:w16cid="http://schemas.microsoft.com/office/word/2016/wordml/cid" xmlns:w16="http://schemas.microsoft.com/office/word/2018/wordml" xmlns:w16du="http://schemas.microsoft.com/office/word/2023/wordml/word16du" xmlns:w16sdtdh="http://schemas.microsoft.com/office/word/2020/wordml/sdtdatahash" xmlns:w16se="http://schemas.microsoft.com/office/word/2015/wordml/symex" xmlns:wpg="http://schemas.microsoft.com/office/word/2010/wordprocessingGroup" xmlns:wpi="http://schemas.microsoft.com/office/word/2010/wordprocessingInk" xmlns:wne="http://schemas.microsoft.com/office/word/2006/wordml" xmlns:wps="http://schemas.microsoft.com/office/word/2010/wordprocessingShape" mc:Ignorable="w14 w15 w16se w16cid w16 w16cex w16sdtdh w16du wp14">
   <w:body>
     <w:p>
       <w:r>
@@ -133,6 +133,119 @@
           <w:rFonts w:ascii="Arial" w:hAnsi="Arial" w:cs="Arial"/>
         </w:rPr>
         <w:t>on the backend server, so that the computation is performed remotely instead of on my local machine and is consistent across all users.</w:t>
+      </w:r>
+    </w:p>
+    <w:p>
+      <w:pPr>
+        <w:pStyle w:val="p1"/>
+        <w:jc w:val="both"/>
+        <w:rPr>
+          <w:rFonts w:ascii="Arial" w:hAnsi="Arial" w:cs="Arial"/>
+          <w:u w:val="single"/>
+        </w:rPr>
+      </w:pPr>
+      <w:r>
+        <w:rPr>
+          <w:rFonts w:ascii="Arial" w:hAnsi="Arial" w:cs="Arial"/>
+          <w:u w:val="single"/>
+        </w:rPr>
+        <w:t>Samuel User Stories (Save/Load Functionality):</w:t>
+      </w:r>
+    </w:p>
+    <w:p>
+      <w:pPr>
+        <w:pStyle w:val="p1"/>
+        <w:rPr>
+          <w:rFonts w:ascii="Arial" w:hAnsi="Arial" w:cs="Arial"/>
+        </w:rPr>
+      </w:pPr>
+      <w:r>
+        <w:rPr>
+          <w:rFonts w:ascii="Arial" w:hAnsi="Arial" w:cs="Arial"/>
+          <w:color w:val="000000"/>
+        </w:rPr>
+        <w:t>As a user, I want to be able to</w:t>
+      </w:r>
+      <w:r>
+        <w:rPr>
+          <w:rStyle w:val="apple-converted-space"/>
+          <w:rFonts w:ascii="Arial" w:eastAsiaTheme="majorEastAsia" w:hAnsi="Arial" w:cs="Arial"/>
+          <w:color w:val="000000"/>
+        </w:rPr>
+        <w:t> </w:t>
+      </w:r>
+      <w:r>
+        <w:rPr>
+          <w:rStyle w:val="Strong"/>
+          <w:rFonts w:ascii="Arial" w:eastAsiaTheme="majorEastAsia" w:hAnsi="Arial" w:cs="Arial"/>
+          <w:b w:val="0"/>
+          <w:bCs w:val="0"/>
+          <w:color w:val="000000"/>
+        </w:rPr>
+        <w:t>save the generated image</w:t>
+      </w:r>
+      <w:r>
+        <w:rPr>
+          <w:rStyle w:val="apple-converted-space"/>
+          <w:rFonts w:ascii="Arial" w:eastAsiaTheme="majorEastAsia" w:hAnsi="Arial" w:cs="Arial"/>
+          <w:color w:val="000000"/>
+        </w:rPr>
+        <w:t> </w:t>
+      </w:r>
+      <w:r>
+        <w:rPr>
+          <w:rFonts w:ascii="Arial" w:hAnsi="Arial" w:cs="Arial"/>
+          <w:color w:val="000000"/>
+        </w:rPr>
+        <w:t>to my local device, so that I can keep a copy of the results produced by the application for later use.</w:t>
+      </w:r>
+    </w:p>
+    <w:p>
+      <w:pPr>
+        <w:pStyle w:val="p1"/>
+        <w:rPr>
+          <w:rFonts w:ascii="Arial" w:hAnsi="Arial" w:cs="Arial"/>
+        </w:rPr>
+      </w:pPr>
+      <w:r>
+        <w:rPr>
+          <w:rFonts w:ascii="Arial" w:hAnsi="Arial" w:cs="Arial"/>
+          <w:color w:val="000000"/>
+        </w:rPr>
+        <w:t>As a user, I want to be able to</w:t>
+      </w:r>
+      <w:r>
+        <w:rPr>
+          <w:rStyle w:val="apple-converted-space"/>
+          <w:rFonts w:ascii="Arial" w:eastAsiaTheme="majorEastAsia" w:hAnsi="Arial" w:cs="Arial"/>
+          <w:color w:val="000000"/>
+        </w:rPr>
+        <w:t> </w:t>
+      </w:r>
+      <w:r>
+        <w:rPr>
+          <w:rStyle w:val="Strong"/>
+          <w:rFonts w:ascii="Arial" w:eastAsiaTheme="majorEastAsia" w:hAnsi="Arial" w:cs="Arial"/>
+          <w:b w:val="0"/>
+          <w:bCs w:val="0"/>
+          <w:color w:val="000000"/>
+        </w:rPr>
+        <w:t>load an existing image</w:t>
+      </w:r>
+      <w:r>
+        <w:rPr>
+          <w:rStyle w:val="apple-converted-space"/>
+          <w:rFonts w:ascii="Arial" w:eastAsiaTheme="majorEastAsia" w:hAnsi="Arial" w:cs="Arial"/>
+          <w:color w:val="000000"/>
+        </w:rPr>
+        <w:t> </w:t>
+      </w:r>
+      <w:r>
+        <w:rPr>
+          <w:rFonts w:ascii="Arial" w:hAnsi="Arial" w:cs="Arial"/>
+          <w:color w:val="000000"/>
+        </w:rPr>
+        <w:t>from my device into the application, so that I can apply filters or make modifications to an image I already have.</w:t>
       </w:r>
     </w:p>
     <w:p>
@@ -166,7 +279,7 @@
 </file>
 
 <file path=word/styles.xml><?xml version="1.0" encoding="utf-8"?>
-<w:styles xmlns:mc="http://schemas.openxmlformats.org/markup-compatibility/2006" xmlns:r="http://schemas.openxmlformats.org/officeDocument/2006/relationships" xmlns:w="http://schemas.openxmlformats.org/wordprocessingml/2006/main" xmlns:w14="http://schemas.microsoft.com/office/word/2010/wordml" xmlns:w15="http://schemas.microsoft.com/office/word/2012/wordml" xmlns:w16cex="http://schemas.microsoft.com/office/word/2018/wordml/cex" xmlns:w16cid="http://schemas.microsoft.com/office/word/2016/wordml/cid" xmlns:w16="http://schemas.microsoft.com/office/word/2018/wordml" xmlns:w16du="http://schemas.microsoft.com/office/word/2023/wordml/word16du" xmlns:w16sdtdh="http://schemas.microsoft.com/office/word/2020/wordml/sdtdatahash" xmlns:w16sdtfl="http://schemas.microsoft.com/office/word/2024/wordml/sdtformatlock" xmlns:w16se="http://schemas.microsoft.com/office/word/2015/wordml/symex" mc:Ignorable="w14 w15 w16se w16cid w16 w16cex w16sdtdh w16sdtfl w16du">
+<w:styles xmlns:mc="http://schemas.openxmlformats.org/markup-compatibility/2006" xmlns:r="http://schemas.openxmlformats.org/officeDocument/2006/relationships" xmlns:w="http://schemas.openxmlformats.org/wordprocessingml/2006/main" xmlns:w14="http://schemas.microsoft.com/office/word/2010/wordml" xmlns:w15="http://schemas.microsoft.com/office/word/2012/wordml" xmlns:w16cex="http://schemas.microsoft.com/office/word/2018/wordml/cex" xmlns:w16cid="http://schemas.microsoft.com/office/word/2016/wordml/cid" xmlns:w16="http://schemas.microsoft.com/office/word/2018/wordml" xmlns:w16du="http://schemas.microsoft.com/office/word/2023/wordml/word16du" xmlns:w16sdtdh="http://schemas.microsoft.com/office/word/2020/wordml/sdtdatahash" xmlns:w16se="http://schemas.microsoft.com/office/word/2015/wordml/symex" mc:Ignorable="w14 w15 w16se w16cid w16 w16cex w16sdtdh w16du">
   <w:docDefaults>
     <w:rPrDefault>
       <w:rPr>
@@ -1096,6 +1209,22 @@
       <w14:ligatures w14:val="none"/>
     </w:rPr>
   </w:style>
+  <w:style w:type="character" w:customStyle="1" w:styleId="apple-converted-space">
+    <w:name w:val="apple-converted-space"/>
+    <w:basedOn w:val="DefaultParagraphFont"/>
+    <w:rsid w:val="00C70711"/>
+  </w:style>
+  <w:style w:type="character" w:styleId="Strong">
+    <w:name w:val="Strong"/>
+    <w:basedOn w:val="DefaultParagraphFont"/>
+    <w:uiPriority w:val="22"/>
+    <w:qFormat/>
+    <w:rsid w:val="00C70711"/>
+    <w:rPr>
+      <w:b/>
+      <w:bCs/>
+    </w:rPr>
+  </w:style>
 </w:styles>
 </file>
 

</xml_diff>